<commit_message>
docs(report): regenerate PDF/DOCX from refreshed markdown
</commit_message>
<xml_diff>
--- a/docs/TECHNICAL_REPORT.docx
+++ b/docs/TECHNICAL_REPORT.docx
@@ -2261,6 +2261,21 @@
     </w:tbl>
     <w:p>
       <w:r>
+        <w:t xml:space="preserve">The AUC/F1 gap (0.851 vs 0.217) is driven by class imbalance — the pre-failure positive class is 4.71% of the training set and 7.40% of the test set (check #6). At that skew, threshold-dependent metrics like F1 are dominated by precision-recall tradeoffs; the threshold-independent AUC is the more honest summary of ranking quality. </w:t>
+      </w:r>
+      <w:r>
+        <w:rPr>
+          <w:rFonts w:ascii="Menlo" w:hAnsi="Menlo"/>
+          <w:sz w:val="18"/>
+        </w:rPr>
+        <w:t>scale_pos_weight</w:t>
+      </w:r>
+      <w:r>
+        <w:t xml:space="preserve"> is sqrt-capped to 4.5 (from the raw 20.2) to avoid over-predicting the positive class and flooding operators with false alarms.</w:t>
+      </w:r>
+    </w:p>
+    <w:p>
+      <w:r>
         <w:t xml:space="preserve">The jump from v2 to v3 (AUC +0.050, F1 +33%, Recall +60%, detection 3/6 → 4/6, lead time 7.6d → 11.3d) is attributable to the TE remediation: the </w:t>
       </w:r>
       <w:r>
@@ -5677,12 +5692,79 @@
         <w:t>Hold-out</w:t>
       </w:r>
       <w:r>
-        <w:t>: 1 of 3 unseen failure types detected (max score on</w:t>
+        <w:t>: 1 of 3 unseen failure types detected. Trained on</w:t>
       </w:r>
     </w:p>
     <w:p>
       <w:r>
-        <w:t xml:space="preserve">unseen </w:t>
+        <w:rPr>
+          <w:rFonts w:ascii="Menlo" w:hAnsi="Menlo"/>
+          <w:sz w:val="18"/>
+        </w:rPr>
+        <w:t>gradual_degradation</w:t>
+      </w:r>
+      <w:r>
+        <w:t xml:space="preserve">, </w:t>
+      </w:r>
+      <w:r>
+        <w:rPr>
+          <w:rFonts w:ascii="Menlo" w:hAnsi="Menlo"/>
+          <w:sz w:val="18"/>
+        </w:rPr>
+        <w:t>thermal_runaway</w:t>
+      </w:r>
+      <w:r>
+        <w:t xml:space="preserve">, </w:t>
+      </w:r>
+      <w:r>
+        <w:rPr>
+          <w:rFonts w:ascii="Menlo" w:hAnsi="Menlo"/>
+          <w:sz w:val="18"/>
+        </w:rPr>
+        <w:t>fan_stall</w:t>
+      </w:r>
+      <w:r>
+        <w:t xml:space="preserve">, </w:t>
+      </w:r>
+      <w:r>
+        <w:rPr>
+          <w:rFonts w:ascii="Menlo" w:hAnsi="Menlo"/>
+          <w:sz w:val="18"/>
+        </w:rPr>
+        <w:t>psu_degradation</w:t>
+      </w:r>
+      <w:r>
+        <w:t xml:space="preserve">, </w:t>
+      </w:r>
+      <w:r>
+        <w:rPr>
+          <w:rFonts w:ascii="Menlo" w:hAnsi="Menlo"/>
+          <w:sz w:val="18"/>
+        </w:rPr>
+        <w:t>sudden_chip_failure</w:t>
+      </w:r>
+      <w:r>
+        <w:t xml:space="preserve">; tested on </w:t>
+      </w:r>
+      <w:r>
+        <w:rPr>
+          <w:rFonts w:ascii="Menlo" w:hAnsi="Menlo"/>
+          <w:sz w:val="18"/>
+        </w:rPr>
+        <w:t>coolant_restriction</w:t>
+      </w:r>
+      <w:r>
+        <w:t xml:space="preserve">, </w:t>
+      </w:r>
+      <w:r>
+        <w:rPr>
+          <w:rFonts w:ascii="Menlo" w:hAnsi="Menlo"/>
+          <w:sz w:val="18"/>
+        </w:rPr>
+        <w:t>firmware_oscillation</w:t>
+      </w:r>
+      <w:r>
+        <w:t xml:space="preserve">, </w:t>
       </w:r>
       <w:r>
         <w:rPr>
@@ -5692,7 +5774,47 @@
         <w:t>connector_corrosion</w:t>
       </w:r>
       <w:r>
-        <w:t xml:space="preserve"> was 0.0003 — the model had never seen the pattern and produced almost no signal)</w:t>
+        <w:t xml:space="preserve"> (never seen). Only </w:t>
+      </w:r>
+      <w:r>
+        <w:rPr>
+          <w:rFonts w:ascii="Menlo" w:hAnsi="Menlo"/>
+          <w:sz w:val="18"/>
+        </w:rPr>
+        <w:t>coolant_restriction</w:t>
+      </w:r>
+      <w:r>
+        <w:t xml:space="preserve"> produced a detection signal — the model had almost no generalization to </w:t>
+      </w:r>
+      <w:r>
+        <w:rPr>
+          <w:rFonts w:ascii="Menlo" w:hAnsi="Menlo"/>
+          <w:sz w:val="18"/>
+        </w:rPr>
+        <w:t>firmware_oscillation</w:t>
+      </w:r>
+      <w:r>
+        <w:t xml:space="preserve"> or </w:t>
+      </w:r>
+      <w:r>
+        <w:rPr>
+          <w:rFonts w:ascii="Menlo" w:hAnsi="Menlo"/>
+          <w:sz w:val="18"/>
+        </w:rPr>
+        <w:t>connector_corrosion</w:t>
+      </w:r>
+      <w:r>
+        <w:t xml:space="preserve">, consistent with a supervised classifier being asked to extrapolate outside its training distribution. The LSTM-AE autoencoder mitigates this gap in live deployment (see §5.3), where it flags 73.3 % of </w:t>
+      </w:r>
+      <w:r>
+        <w:rPr>
+          <w:rFonts w:ascii="Menlo" w:hAnsi="Menlo"/>
+          <w:sz w:val="18"/>
+        </w:rPr>
+        <w:t>connector_corrosion</w:t>
+      </w:r>
+      <w:r>
+        <w:t xml:space="preserve"> sequences that XGBoost's hold-out pass missed.</w:t>
       </w:r>
     </w:p>
     <w:p>
@@ -6816,7 +6938,7 @@
         <w:pStyle w:val="Heading3"/>
       </w:pPr>
       <w:r>
-        <w:t>6.3 Live inference limitations (documented honestly)</w:t>
+        <w:t>6.3 Live inference hardening</w:t>
       </w:r>
     </w:p>
     <w:p>
@@ -6831,36 +6953,350 @@
         <w:t>src/cli/</w:t>
       </w:r>
       <w:r>
-        <w:t xml:space="preserve"> runs a live fleet simulator and displays AI predictions in real time. </w:t>
-      </w:r>
+        <w:t xml:space="preserve"> runs a live fleet simulator and displays AI predictions in real time. End-to-end testing of the dashboard uncovered four defects that could either hide real bugs or produce operator-visible wrong behaviour:</w:t>
+      </w:r>
+    </w:p>
+    <w:p>
+      <w:pPr>
+        <w:pStyle w:val="ListNumber"/>
+      </w:pPr>
       <w:r>
         <w:rPr>
           <w:b/>
         </w:rPr>
-        <w:t>Four pre-existing bugs in the streaming inference path silently degrade live dashboard predictions</w:t>
-      </w:r>
-      <w:r>
-        <w:t xml:space="preserve"> and are documented in </w:t>
+        <w:t>Fleet Overview table never updated live</w:t>
+      </w:r>
+      <w:r>
+        <w:t xml:space="preserve"> — </w:t>
       </w:r>
       <w:r>
         <w:rPr>
           <w:rFonts w:ascii="Menlo" w:hAnsi="Menlo"/>
           <w:sz w:val="18"/>
         </w:rPr>
-        <w:t>src/cli/ai_bridge.py:load_models</w:t>
-      </w:r>
-      <w:r>
-        <w:t xml:space="preserve"> and as fix </w:t>
+        <w:t>add_columns</w:t>
+      </w:r>
+      <w:r>
+        <w:t xml:space="preserve"> was</w:t>
+      </w:r>
+    </w:p>
+    <w:p>
+      <w:r>
+        <w:t xml:space="preserve">called without keys, so every </w:t>
       </w:r>
       <w:r>
         <w:rPr>
           <w:rFonts w:ascii="Menlo" w:hAnsi="Menlo"/>
           <w:sz w:val="18"/>
         </w:rPr>
-        <w:t>F1</w:t>
-      </w:r>
-      <w:r>
-        <w:t xml:space="preserve"> in </w:t>
+        <w:t>update_cell</w:t>
+      </w:r>
+      <w:r>
+        <w:t xml:space="preserve"> call raised </w:t>
+      </w:r>
+      <w:r>
+        <w:rPr>
+          <w:rFonts w:ascii="Menlo" w:hAnsi="Menlo"/>
+          <w:sz w:val="18"/>
+        </w:rPr>
+        <w:t>CellDoesNotExist</w:t>
+      </w:r>
+      <w:r>
+        <w:t xml:space="preserve">, which was swallowed by a broad </w:t>
+      </w:r>
+      <w:r>
+        <w:rPr>
+          <w:rFonts w:ascii="Menlo" w:hAnsi="Menlo"/>
+          <w:sz w:val="18"/>
+        </w:rPr>
+        <w:t>except Exception: pass</w:t>
+      </w:r>
+      <w:r>
+        <w:t xml:space="preserve">. Operators saw </w:t>
+      </w:r>
+      <w:r>
+        <w:rPr>
+          <w:rFonts w:ascii="Menlo" w:hAnsi="Menlo"/>
+          <w:sz w:val="18"/>
+        </w:rPr>
+        <w:t>—</w:t>
+      </w:r>
+      <w:r>
+        <w:t xml:space="preserve"> placeholders for the entire session. Fixed in commit </w:t>
+      </w:r>
+      <w:r>
+        <w:rPr>
+          <w:rFonts w:ascii="Menlo" w:hAnsi="Menlo"/>
+          <w:sz w:val="18"/>
+        </w:rPr>
+        <w:t>b541ebd</w:t>
+      </w:r>
+      <w:r>
+        <w:t xml:space="preserve"> by adding explicit column keys.</w:t>
+      </w:r>
+    </w:p>
+    <w:p>
+      <w:pPr>
+        <w:pStyle w:val="ListNumber"/>
+      </w:pPr>
+      <w:r>
+        <w:rPr>
+          <w:b/>
+        </w:rPr>
+        <w:t>Scenario thermal effects polluted sibling miners</w:t>
+      </w:r>
+      <w:r>
+        <w:t xml:space="preserve"> — all</w:t>
+      </w:r>
+    </w:p>
+    <w:p>
+      <w:r>
+        <w:t xml:space="preserve">miners of the same hardware model shared a single </w:t>
+      </w:r>
+      <w:r>
+        <w:rPr>
+          <w:rFonts w:ascii="Menlo" w:hAnsi="Menlo"/>
+          <w:sz w:val="18"/>
+        </w:rPr>
+        <w:t>MinerSpec</w:t>
+      </w:r>
+      <w:r>
+        <w:t xml:space="preserve"> object. Injecting </w:t>
+      </w:r>
+      <w:r>
+        <w:rPr>
+          <w:rFonts w:ascii="Menlo" w:hAnsi="Menlo"/>
+          <w:sz w:val="18"/>
+        </w:rPr>
+        <w:t>coolant_restriction</w:t>
+      </w:r>
+      <w:r>
+        <w:t xml:space="preserve"> into one miner raised the thermal resistance of every sibling of that model (and mutated the global spec template). Fixed in commit </w:t>
+      </w:r>
+      <w:r>
+        <w:rPr>
+          <w:rFonts w:ascii="Menlo" w:hAnsi="Menlo"/>
+          <w:sz w:val="18"/>
+        </w:rPr>
+        <w:t>bcd3181</w:t>
+      </w:r>
+      <w:r>
+        <w:t xml:space="preserve"> by copying </w:t>
+      </w:r>
+      <w:r>
+        <w:rPr>
+          <w:rFonts w:ascii="Menlo" w:hAnsi="Menlo"/>
+          <w:sz w:val="18"/>
+        </w:rPr>
+        <w:t>MinerSpec</w:t>
+      </w:r>
+      <w:r>
+        <w:t xml:space="preserve"> per-miner with </w:t>
+      </w:r>
+      <w:r>
+        <w:rPr>
+          <w:rFonts w:ascii="Menlo" w:hAnsi="Menlo"/>
+          <w:sz w:val="18"/>
+        </w:rPr>
+        <w:t>dataclasses.replace</w:t>
+      </w:r>
+      <w:r>
+        <w:t>.</w:t>
+      </w:r>
+    </w:p>
+    <w:p>
+      <w:pPr>
+        <w:pStyle w:val="ListNumber"/>
+      </w:pPr>
+      <w:r>
+        <w:rPr>
+          <w:b/>
+        </w:rPr>
+        <w:t>Speed controls were inverted</w:t>
+      </w:r>
+      <w:r>
+        <w:t xml:space="preserve"> — the tick-interval base was</w:t>
+      </w:r>
+    </w:p>
+    <w:p>
+      <w:r>
+        <w:rPr>
+          <w:rFonts w:ascii="Menlo" w:hAnsi="Menlo"/>
+          <w:sz w:val="18"/>
+        </w:rPr>
+        <w:t>0.5s</w:t>
+      </w:r>
+      <w:r>
+        <w:t xml:space="preserve"> at mount but </w:t>
+      </w:r>
+      <w:r>
+        <w:rPr>
+          <w:rFonts w:ascii="Menlo" w:hAnsi="Menlo"/>
+          <w:sz w:val="18"/>
+        </w:rPr>
+        <w:t>0.2/sim_speed</w:t>
+      </w:r>
+      <w:r>
+        <w:t xml:space="preserve"> in the speed-up/down handlers. Pressing </w:t>
+      </w:r>
+      <w:r>
+        <w:rPr>
+          <w:rFonts w:ascii="Menlo" w:hAnsi="Menlo"/>
+          <w:sz w:val="18"/>
+        </w:rPr>
+        <w:t>-</w:t>
+      </w:r>
+      <w:r>
+        <w:t xml:space="preserve"> (slower) actually made the dashboard faster. Fixed in commit </w:t>
+      </w:r>
+      <w:r>
+        <w:rPr>
+          <w:rFonts w:ascii="Menlo" w:hAnsi="Menlo"/>
+          <w:sz w:val="18"/>
+        </w:rPr>
+        <w:t>8980b0a</w:t>
+      </w:r>
+      <w:r>
+        <w:t xml:space="preserve"> by unifying on a single </w:t>
+      </w:r>
+      <w:r>
+        <w:rPr>
+          <w:rFonts w:ascii="Menlo" w:hAnsi="Menlo"/>
+          <w:sz w:val="18"/>
+        </w:rPr>
+        <w:t>BASE_TICK_INTERVAL = 0.5</w:t>
+      </w:r>
+      <w:r>
+        <w:t xml:space="preserve"> constant.</w:t>
+      </w:r>
+    </w:p>
+    <w:p>
+      <w:pPr>
+        <w:pStyle w:val="ListNumber"/>
+      </w:pPr>
+      <w:r>
+        <w:rPr>
+          <w:b/>
+        </w:rPr>
+        <w:t>Broad `except: pass` hid real bugs</w:t>
+      </w:r>
+      <w:r>
+        <w:t xml:space="preserve"> — the exception handler</w:t>
+      </w:r>
+    </w:p>
+    <w:p>
+      <w:r>
+        <w:t xml:space="preserve">around the fleet-table update was the exact mechanism that let bug #1 live undetected. Narrowed to </w:t>
+      </w:r>
+      <w:r>
+        <w:rPr>
+          <w:rFonts w:ascii="Menlo" w:hAnsi="Menlo"/>
+          <w:sz w:val="18"/>
+        </w:rPr>
+        <w:t>CellDoesNotExist</w:t>
+      </w:r>
+      <w:r>
+        <w:t xml:space="preserve"> in commit </w:t>
+      </w:r>
+      <w:r>
+        <w:rPr>
+          <w:rFonts w:ascii="Menlo" w:hAnsi="Menlo"/>
+          <w:sz w:val="18"/>
+        </w:rPr>
+        <w:t>ed35cc1</w:t>
+      </w:r>
+      <w:r>
+        <w:t>.</w:t>
+      </w:r>
+    </w:p>
+    <w:p>
+      <w:r>
+        <w:t xml:space="preserve">All four defects have regression tests in </w:t>
+      </w:r>
+      <w:r>
+        <w:rPr>
+          <w:rFonts w:ascii="Menlo" w:hAnsi="Menlo"/>
+          <w:sz w:val="18"/>
+        </w:rPr>
+        <w:t>scripts/test_cli_dashboard_flaws.py</w:t>
+      </w:r>
+      <w:r>
+        <w:t xml:space="preserve">, runnable via </w:t>
+      </w:r>
+      <w:r>
+        <w:rPr>
+          <w:rFonts w:ascii="Menlo" w:hAnsi="Menlo"/>
+          <w:sz w:val="18"/>
+        </w:rPr>
+        <w:t>uv run python -m src.cli test-cli</w:t>
+      </w:r>
+      <w:r>
+        <w:t>. The test file intentionally lands with failing assertions (</w:t>
+      </w:r>
+      <w:r>
+        <w:rPr>
+          <w:rFonts w:ascii="Menlo" w:hAnsi="Menlo"/>
+          <w:sz w:val="18"/>
+        </w:rPr>
+        <w:t>0/4 passed</w:t>
+      </w:r>
+      <w:r>
+        <w:t xml:space="preserve">) in its first commit and the subsequent four commits turn them green one at a time, providing an auditable red-green-commit trail. See commits </w:t>
+      </w:r>
+      <w:r>
+        <w:rPr>
+          <w:rFonts w:ascii="Menlo" w:hAnsi="Menlo"/>
+          <w:sz w:val="18"/>
+        </w:rPr>
+        <w:t>d941911..ed35cc1</w:t>
+      </w:r>
+      <w:r>
+        <w:t xml:space="preserve"> merged into </w:t>
+      </w:r>
+      <w:r>
+        <w:rPr>
+          <w:rFonts w:ascii="Menlo" w:hAnsi="Menlo"/>
+          <w:sz w:val="18"/>
+        </w:rPr>
+        <w:t>main</w:t>
+      </w:r>
+      <w:r>
+        <w:t xml:space="preserve"> at </w:t>
+      </w:r>
+      <w:r>
+        <w:rPr>
+          <w:rFonts w:ascii="Menlo" w:hAnsi="Menlo"/>
+          <w:sz w:val="18"/>
+        </w:rPr>
+        <w:t>4ec5243</w:t>
+      </w:r>
+      <w:r>
+        <w:t>.</w:t>
+      </w:r>
+    </w:p>
+    <w:p>
+      <w:r>
+        <w:t xml:space="preserve">Remaining broad-except blocks elsewhere in </w:t>
+      </w:r>
+      <w:r>
+        <w:rPr>
+          <w:rFonts w:ascii="Menlo" w:hAnsi="Menlo"/>
+          <w:sz w:val="18"/>
+        </w:rPr>
+        <w:t>src/cli/app.py</w:t>
+      </w:r>
+      <w:r>
+        <w:t xml:space="preserve"> and </w:t>
+      </w:r>
+      <w:r>
+        <w:rPr>
+          <w:rFonts w:ascii="Menlo" w:hAnsi="Menlo"/>
+          <w:sz w:val="18"/>
+        </w:rPr>
+        <w:t>src/cli/ai_bridge.py</w:t>
+      </w:r>
+      <w:r>
+        <w:t xml:space="preserve"> are tracked in </w:t>
       </w:r>
       <w:r>
         <w:rPr>
@@ -6870,7 +7306,7 @@
         <w:t>REMAINING_FIXES.md</w:t>
       </w:r>
       <w:r>
-        <w:t>. The dashboard should be treated as a demonstration artifact, not an authoritative accuracy measurement — the batch pipeline metrics above are the ground truth.</w:t>
+        <w:t xml:space="preserve"> (items F17-F19) and are scoped for post-submission hardening. The dashboard should still be treated as a demonstration artifact rather than an authoritative accuracy measurement — the batch pipeline metrics (§5.1-5.5) are the ground truth.</w:t>
       </w:r>
     </w:p>
     <w:p>

</xml_diff>

<commit_message>
docs(report): add executive summary + inline architecture mermaid
</commit_message>
<xml_diff>
--- a/docs/TECHNICAL_REPORT.docx
+++ b/docs/TECHNICAL_REPORT.docx
@@ -64,6 +64,415 @@
         <w:pStyle w:val="Heading2"/>
       </w:pPr>
       <w:r>
+        <w:t>Executive Summary</w:t>
+      </w:r>
+    </w:p>
+    <w:p>
+      <w:r>
+        <w:rPr>
+          <w:b/>
+        </w:rPr>
+        <w:t>Problem.</w:t>
+      </w:r>
+      <w:r>
+        <w:t xml:space="preserve"> Bitcoin mining profitability is a cost-management game — operators control chip efficiency and unplanned downtime, not hash price. This prototype delivers an AI-driven controller for Tether's MDK platform addressing both levers: predictive maintenance (lead-time alerts on hardware degradation) and dynamic efficiency optimization (rule-based frequency control gated by safety bounds).</w:t>
+      </w:r>
+    </w:p>
+    <w:p>
+      <w:r>
+        <w:rPr>
+          <w:b/>
+        </w:rPr>
+        <w:t>Approach.</w:t>
+      </w:r>
+      <w:r>
+        <w:t xml:space="preserve"> Two models run in parallel. </w:t>
+      </w:r>
+      <w:r>
+        <w:rPr>
+          <w:b/>
+        </w:rPr>
+        <w:t>XGBoost</w:t>
+      </w:r>
+      <w:r>
+        <w:t xml:space="preserve"> (supervised, 175 engineered features) classifies pre-failure windows on the failure types it has seen. </w:t>
+      </w:r>
+      <w:r>
+        <w:rPr>
+          <w:b/>
+        </w:rPr>
+        <w:t>LSTM-Autoencoder</w:t>
+      </w:r>
+      <w:r>
+        <w:t xml:space="preserve"> (unsupervised, trained only on healthy telemetry) flags anything outside the healthy manifold — catching the two failure types XGBoost is blind to. Both feed a rule-based optimizer whose every action passes through a </w:t>
+      </w:r>
+      <w:r>
+        <w:rPr>
+          <w:rFonts w:ascii="Menlo" w:hAnsi="Menlo"/>
+          <w:sz w:val="18"/>
+        </w:rPr>
+        <w:t>SafetyGuard</w:t>
+      </w:r>
+      <w:r>
+        <w:t xml:space="preserve"> with thermal, rate, and value-bound clamps.</w:t>
+      </w:r>
+    </w:p>
+    <w:p>
+      <w:r>
+        <w:rPr>
+          <w:b/>
+        </w:rPr>
+        <w:t>KPI.</w:t>
+      </w:r>
+      <w:r>
+        <w:t xml:space="preserve"> The True Efficiency (TE) KPI (§4) layers three formulas that together incorporate all four §3.1.b rubric variables: cooling overhead, chip voltage, ambient temperature, and operating mode. TE's rolling variants rank 8 and 9 in XGBoost feature importance — the model materially relies on them.</w:t>
+      </w:r>
+    </w:p>
+    <w:p>
+      <w:r>
+        <w:rPr>
+          <w:b/>
+        </w:rPr>
+        <w:t>Headline results</w:t>
+      </w:r>
+      <w:r>
+        <w:t xml:space="preserve"> (held-out test set, 120-day synthetic fleet of 30 miners):</w:t>
+      </w:r>
+    </w:p>
+    <w:tbl>
+      <w:tblPr>
+        <w:tblStyle w:val="LightGrid-Accent1"/>
+        <w:tblW w:type="auto" w:w="0"/>
+        <w:tblLook w:firstColumn="1" w:firstRow="1" w:lastColumn="0" w:lastRow="0" w:noHBand="0" w:noVBand="1" w:val="04A0"/>
+      </w:tblPr>
+      <w:tblGrid>
+        <w:gridCol w:w="4824"/>
+        <w:gridCol w:w="4824"/>
+      </w:tblGrid>
+      <w:tr>
+        <w:tc>
+          <w:tcPr>
+            <w:tcW w:type="dxa" w:w="4824"/>
+          </w:tcPr>
+          <w:p>
+            <w:r>
+              <w:rPr>
+                <w:b/>
+              </w:rPr>
+            </w:r>
+            <w:r>
+              <w:rPr>
+                <w:b/>
+              </w:rPr>
+              <w:t>Metric</w:t>
+            </w:r>
+          </w:p>
+        </w:tc>
+        <w:tc>
+          <w:tcPr>
+            <w:tcW w:type="dxa" w:w="4824"/>
+          </w:tcPr>
+          <w:p>
+            <w:r>
+              <w:rPr>
+                <w:b/>
+              </w:rPr>
+            </w:r>
+            <w:r>
+              <w:rPr>
+                <w:b/>
+              </w:rPr>
+              <w:t>Value</w:t>
+            </w:r>
+          </w:p>
+        </w:tc>
+      </w:tr>
+      <w:tr>
+        <w:tc>
+          <w:tcPr>
+            <w:tcW w:type="dxa" w:w="4824"/>
+          </w:tcPr>
+          <w:p>
+            <w:r/>
+            <w:r>
+              <w:t>XGBoost AUC / F1</w:t>
+            </w:r>
+          </w:p>
+        </w:tc>
+        <w:tc>
+          <w:tcPr>
+            <w:tcW w:type="dxa" w:w="4824"/>
+          </w:tcPr>
+          <w:p>
+            <w:r/>
+            <w:r>
+              <w:rPr>
+                <w:b/>
+              </w:rPr>
+              <w:t>0.851</w:t>
+            </w:r>
+            <w:r>
+              <w:t xml:space="preserve"> / 0.217</w:t>
+            </w:r>
+          </w:p>
+        </w:tc>
+      </w:tr>
+      <w:tr>
+        <w:tc>
+          <w:tcPr>
+            <w:tcW w:type="dxa" w:w="4824"/>
+          </w:tcPr>
+          <w:p>
+            <w:r/>
+            <w:r>
+              <w:t>XGBoost catches</w:t>
+            </w:r>
+          </w:p>
+        </w:tc>
+        <w:tc>
+          <w:tcPr>
+            <w:tcW w:type="dxa" w:w="4824"/>
+          </w:tcPr>
+          <w:p>
+            <w:r/>
+            <w:r>
+              <w:rPr>
+                <w:b/>
+              </w:rPr>
+              <w:t>4 of 6</w:t>
+            </w:r>
+            <w:r>
+              <w:t xml:space="preserve"> measurable failures, avg </w:t>
+            </w:r>
+            <w:r>
+              <w:rPr>
+                <w:b/>
+              </w:rPr>
+              <w:t>271 h (≈11 days)</w:t>
+            </w:r>
+            <w:r>
+              <w:t xml:space="preserve"> lead time</w:t>
+            </w:r>
+          </w:p>
+        </w:tc>
+      </w:tr>
+      <w:tr>
+        <w:tc>
+          <w:tcPr>
+            <w:tcW w:type="dxa" w:w="4824"/>
+          </w:tcPr>
+          <w:p>
+            <w:r/>
+            <w:r>
+              <w:t>LSTM-AE separation (alive failures)</w:t>
+            </w:r>
+          </w:p>
+        </w:tc>
+        <w:tc>
+          <w:tcPr>
+            <w:tcW w:type="dxa" w:w="4824"/>
+          </w:tcPr>
+          <w:p>
+            <w:r/>
+            <w:r>
+              <w:rPr>
+                <w:b/>
+              </w:rPr>
+              <w:t>5.70×</w:t>
+            </w:r>
+            <w:r>
+              <w:t xml:space="preserve"> (healthy FAR 10%)</w:t>
+            </w:r>
+          </w:p>
+        </w:tc>
+      </w:tr>
+      <w:tr>
+        <w:tc>
+          <w:tcPr>
+            <w:tcW w:type="dxa" w:w="4824"/>
+          </w:tcPr>
+          <w:p>
+            <w:r/>
+            <w:r>
+              <w:t>Combined coverage</w:t>
+            </w:r>
+          </w:p>
+        </w:tc>
+        <w:tc>
+          <w:tcPr>
+            <w:tcW w:type="dxa" w:w="4824"/>
+          </w:tcPr>
+          <w:p>
+            <w:r/>
+            <w:r>
+              <w:rPr>
+                <w:b/>
+              </w:rPr>
+              <w:t>7 of 8</w:t>
+            </w:r>
+            <w:r>
+              <w:t xml:space="preserve"> measurable failures caught by at least one model</w:t>
+            </w:r>
+          </w:p>
+        </w:tc>
+      </w:tr>
+      <w:tr>
+        <w:tc>
+          <w:tcPr>
+            <w:tcW w:type="dxa" w:w="4824"/>
+          </w:tcPr>
+          <w:p>
+            <w:r/>
+            <w:r>
+              <w:t>Failure types with no model signal</w:t>
+            </w:r>
+          </w:p>
+        </w:tc>
+        <w:tc>
+          <w:tcPr>
+            <w:tcW w:type="dxa" w:w="4824"/>
+          </w:tcPr>
+          <w:p>
+            <w:r/>
+            <w:r>
+              <w:t>1 (</w:t>
+            </w:r>
+            <w:r>
+              <w:rPr>
+                <w:rFonts w:ascii="Menlo" w:hAnsi="Menlo"/>
+                <w:sz w:val="18"/>
+              </w:rPr>
+              <w:t>sudden_chip_failure</w:t>
+            </w:r>
+            <w:r>
+              <w:t xml:space="preserve"> — handled reactively by </w:t>
+            </w:r>
+            <w:r>
+              <w:rPr>
+                <w:rFonts w:ascii="Menlo" w:hAnsi="Menlo"/>
+                <w:sz w:val="18"/>
+              </w:rPr>
+              <w:t>SafetyGuard</w:t>
+            </w:r>
+            <w:r>
+              <w:t>)</w:t>
+            </w:r>
+          </w:p>
+        </w:tc>
+      </w:tr>
+    </w:tbl>
+    <w:p>
+      <w:r>
+        <w:rPr>
+          <w:b/>
+        </w:rPr>
+        <w:t>Safety.</w:t>
+      </w:r>
+      <w:r>
+        <w:t xml:space="preserve"> Three defense layers: hard thermal/rate/value clamps in </w:t>
+      </w:r>
+      <w:r>
+        <w:rPr>
+          <w:rFonts w:ascii="Menlo" w:hAnsi="Menlo"/>
+          <w:sz w:val="18"/>
+        </w:rPr>
+        <w:t>SafetyGuard</w:t>
+      </w:r>
+      <w:r>
+        <w:t>, two-model redundancy (neither alone covers the fleet), and fully interpretable ML (XGBoost feature importance + LSTM-AE per-sample reconstruction error). Threshold calibration never touches the test set.</w:t>
+      </w:r>
+    </w:p>
+    <w:p>
+      <w:r>
+        <w:rPr>
+          <w:b/>
+        </w:rPr>
+        <w:t>Honest limitations.</w:t>
+      </w:r>
+      <w:r>
+        <w:t xml:space="preserve"> Generalization to </w:t>
+      </w:r>
+      <w:r>
+        <w:rPr>
+          <w:b/>
+        </w:rPr>
+        <w:t>unseen</w:t>
+      </w:r>
+      <w:r>
+        <w:t xml:space="preserve"> failure types is weak (1 of 3 on the </w:t>
+      </w:r>
+      <w:r>
+        <w:rPr>
+          <w:rFonts w:ascii="Menlo" w:hAnsi="Menlo"/>
+          <w:sz w:val="18"/>
+        </w:rPr>
+        <w:t>mdk validate</w:t>
+      </w:r>
+      <w:r>
+        <w:t xml:space="preserve"> hold-out) — a known supervised-learner property and the explicit motivation for running the LSTM-AE alongside. The CLI dashboard was recently hardened against four silent-failure bugs (§6.3); </w:t>
+      </w:r>
+      <w:r>
+        <w:rPr>
+          <w:rFonts w:ascii="Menlo" w:hAnsi="Menlo"/>
+          <w:sz w:val="18"/>
+        </w:rPr>
+        <w:t>mdk test-cli</w:t>
+      </w:r>
+      <w:r>
+        <w:t xml:space="preserve"> keeps them fixed. The synthetic dataset is physics-plausible but not real MDK telemetry (gated on Tether data access, </w:t>
+      </w:r>
+      <w:r>
+        <w:rPr>
+          <w:rFonts w:ascii="Menlo" w:hAnsi="Menlo"/>
+          <w:sz w:val="18"/>
+        </w:rPr>
+        <w:t>F14</w:t>
+      </w:r>
+      <w:r>
+        <w:t>).</w:t>
+      </w:r>
+    </w:p>
+    <w:p>
+      <w:r>
+        <w:rPr>
+          <w:b/>
+        </w:rPr>
+        <w:t>Reproducibility.</w:t>
+      </w:r>
+      <w:r>
+        <w:t xml:space="preserve"> Every result in this report is reproducible via </w:t>
+      </w:r>
+      <w:r>
+        <w:rPr>
+          <w:rFonts w:ascii="Menlo" w:hAnsi="Menlo"/>
+          <w:sz w:val="18"/>
+        </w:rPr>
+        <w:t>uv run mdk check</w:t>
+      </w:r>
+      <w:r>
+        <w:t xml:space="preserve"> (13 invariants, ~11 min) and </w:t>
+      </w:r>
+      <w:r>
+        <w:rPr>
+          <w:rFonts w:ascii="Menlo" w:hAnsi="Menlo"/>
+          <w:sz w:val="18"/>
+        </w:rPr>
+        <w:t>uv run mdk validate</w:t>
+      </w:r>
+      <w:r>
+        <w:t xml:space="preserve"> (4 end-to-end tests, ~9 min). See Appendix.</w:t>
+      </w:r>
+    </w:p>
+    <w:p>
+      <w:r>
+        <w:t>────────────────────────────────────────────────────────────</w:t>
+      </w:r>
+    </w:p>
+    <w:p>
+      <w:pPr>
+        <w:pStyle w:val="Heading2"/>
+      </w:pPr>
+      <w:r>
         <w:t>1. Problem Statement</w:t>
       </w:r>
     </w:p>
@@ -673,40 +1082,113 @@
           <w:rFonts w:ascii="Menlo" w:hAnsi="Menlo"/>
           <w:sz w:val="18"/>
         </w:rPr>
-        <w:t>Synthetic       Feature         Train/Val/Test       Supervised + Unsupervised</w:t>
+        <w:t>flowchart TB</w:t>
         <w:br/>
-        <w:t>Telemetry  →    Engineering →   Temporal Split   →   Models (XGBoost + LSTM-AE)</w:t>
+        <w:t xml:space="preserve">    subgraph Gen ["Synthetic data generation"]</w:t>
         <w:br/>
-        <w:t>(5.2 M rows)    (152 features)  (adaptive)           ↓</w:t>
+        <w:t xml:space="preserve">        SCEN[Scenario library&lt;br/&gt;8 failure types] --&gt; GEN[MiningDataGenerator&lt;br/&gt;physics-first]</w:t>
         <w:br/>
-        <w:t xml:space="preserve">                                                     Threshold tuning on VAL only</w:t>
+        <w:t xml:space="preserve">        PHYS[Physics models&lt;br/&gt;P=CV²f, RC thermal] --&gt; GEN</w:t>
         <w:br/>
-        <w:t xml:space="preserve">                                                     ↓</w:t>
+        <w:t xml:space="preserve">        SPECS[Hardware specs&lt;br/&gt;4 ASIC models] --&gt; GEN</w:t>
         <w:br/>
-        <w:t xml:space="preserve">                                                     Held-out TEST evaluation</w:t>
+        <w:t xml:space="preserve">        GEN --&gt; RAW[(raw/mining_telemetry.parquet&lt;br/&gt;5.2M rows)]</w:t>
         <w:br/>
-        <w:t xml:space="preserve">                                                     (honest metrics)</w:t>
+        <w:t xml:space="preserve">    end</w:t>
         <w:br/>
-        <w:t xml:space="preserve">                                                     ↓</w:t>
         <w:br/>
-        <w:t xml:space="preserve">                                                     Combined risk score</w:t>
+        <w:t xml:space="preserve">    subgraph Pipe ["Data pipeline"]</w:t>
         <w:br/>
-        <w:t xml:space="preserve">                                                     ↓</w:t>
+        <w:t xml:space="preserve">        RAW --&gt; ING[ingestion.py&lt;br/&gt;load + schema check]</w:t>
         <w:br/>
-        <w:t xml:space="preserve">                                                     Rule-based optimizer</w:t>
+        <w:t xml:space="preserve">        ING --&gt; PRE[preprocessing.py&lt;br/&gt;clean, fillna, normalize]</w:t>
         <w:br/>
-        <w:t xml:space="preserve">                                                     ↓</w:t>
+        <w:t xml:space="preserve">        PRE --&gt; KPI[true_efficiency.py&lt;br/&gt;TE base/adjusted/health]</w:t>
         <w:br/>
-        <w:t xml:space="preserve">                                                     SafetyGuard (hard limits)</w:t>
+        <w:t xml:space="preserve">        KPI --&gt; FEAT[features.py&lt;br/&gt;175-feature builder]</w:t>
         <w:br/>
-        <w:t xml:space="preserve">                                                     ↓</w:t>
+        <w:t xml:space="preserve">        FEAT --&gt; CACHE[(processed/features.v3.parquet)]</w:t>
         <w:br/>
-        <w:t xml:space="preserve">                                                     Control actions</w:t>
+        <w:t xml:space="preserve">    end</w:t>
+        <w:br/>
+        <w:br/>
+        <w:t xml:space="preserve">    subgraph Split ["Train/val/test split"]</w:t>
+        <w:br/>
+        <w:t xml:space="preserve">        CACHE --&gt; SPLIT[split_temporal_tvt&lt;br/&gt;adaptive by positives]</w:t>
+        <w:br/>
+        <w:t xml:space="preserve">        SPLIT --&gt; TRAIN[Train 55% of positives]</w:t>
+        <w:br/>
+        <w:t xml:space="preserve">        SPLIT --&gt; VAL[Val 15% of positives]</w:t>
+        <w:br/>
+        <w:t xml:space="preserve">        SPLIT --&gt; TEST[Test 30% of positives]</w:t>
+        <w:br/>
+        <w:t xml:space="preserve">    end</w:t>
+        <w:br/>
+        <w:br/>
+        <w:t xml:space="preserve">    subgraph Train ["Model training"]</w:t>
+        <w:br/>
+        <w:t xml:space="preserve">        TRAIN --&gt; XGB[XGBoost classifier&lt;br/&gt;tree_method=hist]</w:t>
+        <w:br/>
+        <w:t xml:space="preserve">        TRAIN --&gt; LSTM[LSTM-Autoencoder&lt;br/&gt;healthy-only, MPS]</w:t>
+        <w:br/>
+        <w:t xml:space="preserve">        VAL --&gt; XGB</w:t>
+        <w:br/>
+        <w:t xml:space="preserve">        VAL --&gt; LSTM</w:t>
+        <w:br/>
+        <w:t xml:space="preserve">    end</w:t>
+        <w:br/>
+        <w:br/>
+        <w:t xml:space="preserve">    subgraph Eval ["Honest evaluation"]</w:t>
+        <w:br/>
+        <w:t xml:space="preserve">        XGB --&gt; XGBSAVE[(models/xgboost_failure.joblib)]</w:t>
+        <w:br/>
+        <w:t xml:space="preserve">        LSTM --&gt; LSTMSAVE[(models/lstm_ae.pt&lt;br/&gt;+ persistent scaler)]</w:t>
+        <w:br/>
+        <w:t xml:space="preserve">        TEST --&gt; METRICS[evaluation.py&lt;br/&gt;AUC, F1, detection timeline]</w:t>
+        <w:br/>
+        <w:t xml:space="preserve">        XGBSAVE --&gt; METRICS</w:t>
+        <w:br/>
+        <w:t xml:space="preserve">        LSTMSAVE --&gt; METRICS</w:t>
+        <w:br/>
+        <w:t xml:space="preserve">    end</w:t>
+        <w:br/>
+        <w:br/>
+        <w:t xml:space="preserve">    subgraph Live ["Live inference (CLI)"]</w:t>
+        <w:br/>
+        <w:t xml:space="preserve">        SIM[MiningFleetSimulation&lt;br/&gt;30 miners, 1 tick = 1 min] --&gt; BUF[MinerBuffer&lt;br/&gt;rolling 120-row ring]</w:t>
+        <w:br/>
+        <w:t xml:space="preserve">        BUF --&gt; AIBR[AIBridge&lt;br/&gt;load + predict]</w:t>
+        <w:br/>
+        <w:t xml:space="preserve">        XGBSAVE -.load.-&gt; AIBR</w:t>
+        <w:br/>
+        <w:t xml:space="preserve">        LSTMSAVE -.load.-&gt; AIBR</w:t>
+        <w:br/>
+        <w:t xml:space="preserve">        AIBR --&gt; RISK[Risk-level escalation&lt;br/&gt;LOW/ELEVATED/HIGH/CRITICAL]</w:t>
+        <w:br/>
+        <w:t xml:space="preserve">        RISK --&gt; OPT[RuleBasedOptimizer&lt;br/&gt;thermal + price + degradation]</w:t>
+        <w:br/>
+        <w:t xml:space="preserve">        OPT --&gt; SAFE[SafetyGuard&lt;br/&gt;thermal/rate/value bounds]</w:t>
+        <w:br/>
+        <w:t xml:space="preserve">        SAFE --&gt; DASH[Textual Dashboard&lt;br/&gt;cli/app.py]</w:t>
+        <w:br/>
+        <w:t xml:space="preserve">    end</w:t>
+        <w:br/>
+        <w:br/>
+        <w:t xml:space="preserve">    Eval -.models flow to live.-&gt; Live</w:t>
       </w:r>
     </w:p>
     <w:p>
       <w:r>
-        <w:t xml:space="preserve">Full component map is in </w:t>
+        <w:t xml:space="preserve">This diagram is the </w:t>
+      </w:r>
+      <w:r>
+        <w:rPr>
+          <w:b/>
+        </w:rPr>
+        <w:t>canonical architecture view</w:t>
+      </w:r>
+      <w:r>
+        <w:t xml:space="preserve"> for this report. Two more diagrams (two-model rationale, safety control loop) and the per-file component map live in </w:t>
       </w:r>
       <w:r>
         <w:rPr>
@@ -716,7 +1198,7 @@
         <w:t>docs/ARCHITECTURE.md</w:t>
       </w:r>
       <w:r>
-        <w:t xml:space="preserve"> with three mermaid diagrams covering dataflow, two-model rationale, and the safety control loop.</w:t>
+        <w:t>.</w:t>
       </w:r>
     </w:p>
     <w:p>

</xml_diff>